<commit_message>
Realign CV with Full-Stack Developer positioning
</commit_message>
<xml_diff>
--- a/assets/cv/CV_Joni_Hermawan.docx
+++ b/assets/cv/CV_Joni_Hermawan.docx
@@ -14,7 +14,7 @@
     </w:p>
     <w:p>
       <w:pPr>
-        <w:spacing w:before="40" w:after="100"/>
+        <w:spacing w:before="40" w:after="80"/>
       </w:pPr>
       <w:r>
         <w:rPr>
@@ -22,7 +22,7 @@
           <w:color w:val="2563EB"/>
           <w:sz w:val="21"/>
         </w:rPr>
-        <w:t>Senior IT System Engineer</w:t>
+        <w:t>Full-Stack Developer</w:t>
       </w:r>
     </w:p>
     <w:p>
@@ -30,7 +30,7 @@
         <w:pBdr>
           <w:bottom w:val="single" w:sz="18" w:space="4" w:color="2563EB"/>
         </w:pBdr>
-        <w:spacing w:after="160"/>
+        <w:spacing w:after="140"/>
       </w:pPr>
       <w:r>
         <w:rPr>
@@ -45,7 +45,7 @@
         <w:pBdr>
           <w:bottom w:val="single" w:sz="6" w:space="4" w:color="DCE1E8"/>
         </w:pBdr>
-        <w:spacing w:before="120" w:after="80"/>
+        <w:spacing w:before="100" w:after="60"/>
       </w:pPr>
       <w:r>
         <w:rPr>
@@ -57,14 +57,14 @@
     </w:p>
     <w:p>
       <w:pPr>
-        <w:spacing w:after="160"/>
+        <w:spacing w:after="120"/>
         <w:jc w:val="both"/>
       </w:pPr>
       <w:r>
-        <w:t xml:space="preserve">IT System Engineer dengan 7+ tahun pengalaman membangun dan mengamankan infrastruktur TI skala enterprise, meniti karier dari operasional perangkat perbankan (QC &amp; konfigurasi keamanan mesin EDC) hingga Senior System Engineer. Berpengalaman menangani sistem keamanan pembayaran (HSM Payshield), memimpin migrasi infrastruktur legacy ke lingkungan yang lebih aman dan scalable, serta membangun sistem observability (Grafana/Prometheus) yang meningkatkan uptime server sebesar 15%. Perjalanan karier dari hardware </w:t>
+        <w:t>Full-Stack Developer dengan fondasi 7+ tahun sebagai Senior IT System Engineer di infrastruktur TI skala enterprise. Membangun aplikasi web full-stack menggunakan Next.js, React, dan Golang, memadukan pemahaman backend, database, dan keamanan sistem yang jarang dimiliki developer lain — termasuk pengalaman langsung mengelola Hardware Security Module (HSM Payshield) dan memimpin migrasi infrastruktur yang meningkatkan uptime server sebesar 15%. Kombinasi latar belakang ini memberi perspektif menyeluruh dalam</w:t>
       </w:r>
       <w:r>
-        <w:t>perbankan tingkat lapangan hingga arsitektur infrastruktur senior menjadikan saya engineer yang memahami sistem keamanan transaksi secara menyeluruh — dari perangkat fisik hingga infrastruktur backend.</w:t>
+        <w:t xml:space="preserve"> merancang aplikasi yang aman, scalable, dan siap produksi.</w:t>
       </w:r>
     </w:p>
     <w:p>
@@ -72,7 +72,88 @@
         <w:pBdr>
           <w:bottom w:val="single" w:sz="6" w:space="4" w:color="DCE1E8"/>
         </w:pBdr>
-        <w:spacing w:before="120" w:after="80"/>
+        <w:spacing w:before="100" w:after="60"/>
+      </w:pPr>
+      <w:r>
+        <w:rPr>
+          <w:b/>
+          <w:color w:val="0D9488"/>
+        </w:rPr>
+        <w:t>PROYEK PILIHAN</w:t>
+      </w:r>
+    </w:p>
+    <w:p>
+      <w:pPr>
+        <w:spacing w:after="40"/>
+      </w:pPr>
+      <w:r>
+        <w:rPr>
+          <w:b/>
+          <w:color w:val="10131A"/>
+        </w:rPr>
+        <w:t>Nota POS</w:t>
+      </w:r>
+      <w:r>
+        <w:rPr>
+          <w:i/>
+          <w:color w:val="4A5568"/>
+        </w:rPr>
+        <w:t xml:space="preserve"> (Next.js, Golang, SQL Server)</w:t>
+      </w:r>
+      <w:r>
+        <w:t xml:space="preserve"> — Sistem kasir multi-role dengan integrasi pembayaran QRIS &amp; EDC dan cetak struk thermal.</w:t>
+      </w:r>
+    </w:p>
+    <w:p>
+      <w:pPr>
+        <w:spacing w:after="40"/>
+      </w:pPr>
+      <w:r>
+        <w:rPr>
+          <w:b/>
+          <w:color w:val="10131A"/>
+        </w:rPr>
+        <w:t>TDS</w:t>
+      </w:r>
+      <w:r>
+        <w:rPr>
+          <w:i/>
+          <w:color w:val="4A5568"/>
+        </w:rPr>
+        <w:t xml:space="preserve"> (Python, Pandas, JavaScript)</w:t>
+      </w:r>
+      <w:r>
+        <w:t xml:space="preserve"> — Tools pembersihan &amp; standardisasi 60.000+ data Serial Number EDC, dipakai tim operasional sehari-hari.</w:t>
+      </w:r>
+    </w:p>
+    <w:p>
+      <w:pPr>
+        <w:spacing w:after="120"/>
+      </w:pPr>
+      <w:r>
+        <w:rPr>
+          <w:b/>
+          <w:color w:val="10131A"/>
+        </w:rPr>
+        <w:t>Web Project Management Dashboard</w:t>
+      </w:r>
+      <w:r>
+        <w:rPr>
+          <w:i/>
+          <w:color w:val="4A5568"/>
+        </w:rPr>
+        <w:t xml:space="preserve"> (Next.js, Golang, SQL Server)</w:t>
+      </w:r>
+      <w:r>
+        <w:t xml:space="preserve"> — Dashboard manajemen proyek dengan migrasi arsitektur dari Vite ke Next.js App Router.</w:t>
+      </w:r>
+    </w:p>
+    <w:p>
+      <w:pPr>
+        <w:pBdr>
+          <w:bottom w:val="single" w:sz="6" w:space="4" w:color="DCE1E8"/>
+        </w:pBdr>
+        <w:spacing w:before="100" w:after="60"/>
       </w:pPr>
       <w:r>
         <w:rPr>
@@ -315,7 +396,7 @@
         <w:pBdr>
           <w:bottom w:val="single" w:sz="6" w:space="4" w:color="DCE1E8"/>
         </w:pBdr>
-        <w:spacing w:before="120" w:after="80"/>
+        <w:spacing w:before="100" w:after="60"/>
       </w:pPr>
       <w:r>
         <w:rPr>
@@ -355,7 +436,7 @@
         <w:pBdr>
           <w:bottom w:val="single" w:sz="6" w:space="4" w:color="DCE1E8"/>
         </w:pBdr>
-        <w:spacing w:before="120" w:after="80"/>
+        <w:spacing w:before="100" w:after="60"/>
       </w:pPr>
       <w:r>
         <w:rPr>
@@ -374,10 +455,10 @@
           <w:b/>
           <w:color w:val="10131A"/>
         </w:rPr>
-        <w:t xml:space="preserve">Infrastruktur &amp; OS: </w:t>
+        <w:t xml:space="preserve">Web Development: </w:t>
       </w:r>
       <w:r>
-        <w:t>Windows Server 2016/2019/2025, Linux (Ubuntu)</w:t>
+        <w:t>JavaScript, React, Next.js, Tailwind CSS, HTML5/CSS3, JWT Auth</w:t>
       </w:r>
     </w:p>
     <w:p>
@@ -389,70 +470,25 @@
           <w:b/>
           <w:color w:val="10131A"/>
         </w:rPr>
-        <w:t xml:space="preserve">Sistem Pembayaran &amp; Keamanan: </w:t>
+        <w:t xml:space="preserve">Backend &amp; Database: </w:t>
       </w:r>
       <w:r>
-        <w:t>Manajemen HSM Payshield, Standar Kepatuhan &amp; Keamanan TI</w:t>
+        <w:t>Golang, SQL Server, Desain REST API</w:t>
       </w:r>
     </w:p>
     <w:p>
       <w:pPr>
-        <w:spacing w:after="40"/>
+        <w:spacing w:after="120"/>
       </w:pPr>
       <w:r>
         <w:rPr>
           <w:b/>
           <w:color w:val="10131A"/>
         </w:rPr>
-        <w:t xml:space="preserve">Monitoring &amp; Observabilitas: </w:t>
+        <w:t xml:space="preserve">Infrastruktur &amp; Keamanan: </w:t>
       </w:r>
       <w:r>
-        <w:t>Grafana, Prometheus, Optimasi Performa</w:t>
-      </w:r>
-    </w:p>
-    <w:p>
-      <w:pPr>
-        <w:spacing w:after="40"/>
-      </w:pPr>
-      <w:r>
-        <w:rPr>
-          <w:b/>
-          <w:color w:val="10131A"/>
-        </w:rPr>
-        <w:t xml:space="preserve">Cloud: </w:t>
-      </w:r>
-      <w:r>
-        <w:t>AWS, Azure</w:t>
-      </w:r>
-    </w:p>
-    <w:p>
-      <w:pPr>
-        <w:spacing w:after="40"/>
-      </w:pPr>
-      <w:r>
-        <w:rPr>
-          <w:b/>
-          <w:color w:val="10131A"/>
-        </w:rPr>
-        <w:t xml:space="preserve">Frontend &amp; Pengembangan Web: </w:t>
-      </w:r>
-      <w:r>
-        <w:t>JavaScript, React, Next.js, Tailwind CSS, Python, Golang (dasar), NGINX</w:t>
-      </w:r>
-    </w:p>
-    <w:p>
-      <w:pPr>
-        <w:spacing w:after="160"/>
-      </w:pPr>
-      <w:r>
-        <w:rPr>
-          <w:b/>
-          <w:color w:val="10131A"/>
-        </w:rPr>
-        <w:t xml:space="preserve">Lainnya: </w:t>
-      </w:r>
-      <w:r>
-        <w:t>Troubleshooting &amp; Technical Support tingkat lanjut</w:t>
+        <w:t>Linux/Windows Server, AWS/Azure, HSM Payshield, Grafana/Prometheus, Standar Kepatuhan &amp; Keamanan TI, Python, NGINX</w:t>
       </w:r>
     </w:p>
     <w:p>
@@ -460,7 +496,7 @@
         <w:pBdr>
           <w:bottom w:val="single" w:sz="6" w:space="4" w:color="DCE1E8"/>
         </w:pBdr>
-        <w:spacing w:before="120" w:after="80"/>
+        <w:spacing w:before="100" w:after="60"/>
       </w:pPr>
       <w:r>
         <w:rPr>
@@ -506,7 +542,7 @@
     </w:p>
     <w:sectPr>
       <w:pgSz w:w="11906" w:h="16838"/>
-      <w:pgMar w:top="567" w:right="907" w:bottom="454" w:left="907" w:header="720" w:footer="720" w:gutter="0"/>
+      <w:pgMar w:top="454" w:right="907" w:bottom="340" w:left="907" w:header="720" w:footer="720" w:gutter="0"/>
       <w:cols w:space="720"/>
       <w:docGrid w:linePitch="360"/>
     </w:sectPr>
@@ -687,31 +723,31 @@
       </w:rPr>
     </w:lvl>
   </w:abstractNum>
-  <w:num w:numId="1" w16cid:durableId="380205529">
+  <w:num w:numId="1" w16cid:durableId="1235973797">
     <w:abstractNumId w:val="8"/>
   </w:num>
-  <w:num w:numId="2" w16cid:durableId="202327878">
+  <w:num w:numId="2" w16cid:durableId="1193693669">
     <w:abstractNumId w:val="6"/>
   </w:num>
-  <w:num w:numId="3" w16cid:durableId="1400789">
+  <w:num w:numId="3" w16cid:durableId="1354066579">
     <w:abstractNumId w:val="5"/>
   </w:num>
-  <w:num w:numId="4" w16cid:durableId="1504658642">
+  <w:num w:numId="4" w16cid:durableId="56830174">
     <w:abstractNumId w:val="4"/>
   </w:num>
-  <w:num w:numId="5" w16cid:durableId="596982252">
+  <w:num w:numId="5" w16cid:durableId="1371105676">
     <w:abstractNumId w:val="7"/>
   </w:num>
-  <w:num w:numId="6" w16cid:durableId="289022460">
+  <w:num w:numId="6" w16cid:durableId="820536388">
     <w:abstractNumId w:val="3"/>
   </w:num>
-  <w:num w:numId="7" w16cid:durableId="1813449268">
+  <w:num w:numId="7" w16cid:durableId="651716159">
     <w:abstractNumId w:val="2"/>
   </w:num>
-  <w:num w:numId="8" w16cid:durableId="1151290381">
+  <w:num w:numId="8" w16cid:durableId="1783574241">
     <w:abstractNumId w:val="1"/>
   </w:num>
-  <w:num w:numId="9" w16cid:durableId="245843538">
+  <w:num w:numId="9" w16cid:durableId="1422801995">
     <w:abstractNumId w:val="0"/>
   </w:num>
 </w:numbering>

</xml_diff>